<commit_message>
docs: les quatre Word regeneres sur contact@breakeatapp.com
Le fichier des CGV etait verrouille par Word lors du passage precedent et
etait reste a l'ancienne adresse. Les quatre portent desormais la meme.

Co-Authored-By: Claude Opus 5 <noreply@anthropic.com>
</commit_message>
<xml_diff>
--- a/GUIDE_DEVELOPPEMENT/documents-legaux/CONDITIONS_GENERALES_DE_VENTE.docx
+++ b/GUIDE_DEVELOPPEMENT/documents-legaux/CONDITIONS_GENERALES_DE_VENTE.docx
@@ -127,7 +127,7 @@
           <w:sz w:val="22"/>
           <w:szCs w:val="22"/>
         </w:rPr>
-        <w:t xml:space="preserve">E-mail : reminotta@breakeatapp.com — Téléphone : 06 46 69 56 75.</w:t>
+        <w:t xml:space="preserve">E-mail : contact@breakeatapp.com — Téléphone : 06 46 69 56 75.</w:t>
       </w:r>
     </w:p>
     <w:p>
@@ -683,7 +683,7 @@
           <w:sz w:val="22"/>
           <w:szCs w:val="22"/>
         </w:rPr>
-        <w:t xml:space="preserve">Pour les difficultés liées au fonctionnement technique de l’application : reminotta@breakeatapp.com ou 06 46 69 56 75.</w:t>
+        <w:t xml:space="preserve">Pour les difficultés liées au fonctionnement technique de l’application : contact@breakeatapp.com ou 06 46 69 56 75.</w:t>
       </w:r>
     </w:p>
     <w:p>
@@ -1109,7 +1109,7 @@
           <w:sz w:val="22"/>
           <w:szCs w:val="22"/>
         </w:rPr>
-        <w:t xml:space="preserve">Pour les questions relatives au fonctionnement technique de la plateforme : BREAK EAT APP, 91 allée des Chardonnerets, 13013 Marseille, France ; reminotta@breakeatapp.com ; 06 46 69 56 75.</w:t>
+        <w:t xml:space="preserve">Pour les questions relatives au fonctionnement technique de la plateforme : BREAK EAT APP, 91 allée des Chardonnerets, 13013 Marseille, France ; contact@breakeatapp.com ; 06 46 69 56 75.</w:t>
       </w:r>
     </w:p>
     <w:p>

</xml_diff>